<commit_message>
Se siguen añadiendo controllers
</commit_message>
<xml_diff>
--- a/GestionEventos/Archivos/JSON.docx
+++ b/GestionEventos/Archivos/JSON.docx
@@ -292,6 +292,193 @@
       <w:r>
         <w:t xml:space="preserve">  "actividades": []</w:t>
       </w:r>
+    </w:p>
+    <w:p>
+      <w:r>
+        <w:t>}</w:t>
+      </w:r>
+    </w:p>
+    <w:p/>
+    <w:p>
+      <w:r>
+        <w:t>ACTIVIDADES</w:t>
+      </w:r>
+    </w:p>
+    <w:p>
+      <w:r>
+        <w:t>{</w:t>
+      </w:r>
+    </w:p>
+    <w:p>
+      <w:r>
+        <w:t xml:space="preserve">  "</w:t>
+      </w:r>
+      <w:proofErr w:type="spellStart"/>
+      <w:r>
+        <w:t>id_Evento</w:t>
+      </w:r>
+      <w:proofErr w:type="spellEnd"/>
+      <w:r>
+        <w:t>": 1,</w:t>
+      </w:r>
+    </w:p>
+    <w:p>
+      <w:r>
+        <w:t xml:space="preserve">  "</w:t>
+      </w:r>
+      <w:proofErr w:type="spellStart"/>
+      <w:r>
+        <w:t>id_Ponente</w:t>
+      </w:r>
+      <w:proofErr w:type="spellEnd"/>
+      <w:r>
+        <w:t>": 5,</w:t>
+      </w:r>
+    </w:p>
+    <w:p>
+      <w:r>
+        <w:t xml:space="preserve">  "titulo": "Sesión de Live </w:t>
+      </w:r>
+      <w:proofErr w:type="spellStart"/>
+      <w:r>
+        <w:t>Coding</w:t>
+      </w:r>
+      <w:proofErr w:type="spellEnd"/>
+      <w:r>
+        <w:t>",</w:t>
+      </w:r>
+    </w:p>
+    <w:p>
+      <w:r>
+        <w:t xml:space="preserve">  "</w:t>
+      </w:r>
+      <w:proofErr w:type="spellStart"/>
+      <w:r>
+        <w:t>descripcion</w:t>
+      </w:r>
+      <w:proofErr w:type="spellEnd"/>
+      <w:r>
+        <w:t>": "Desarrollo de una API paso a paso.",</w:t>
+      </w:r>
+    </w:p>
+    <w:p>
+      <w:r>
+        <w:t xml:space="preserve">  "</w:t>
+      </w:r>
+      <w:proofErr w:type="spellStart"/>
+      <w:r>
+        <w:t>horaInicio</w:t>
+      </w:r>
+      <w:proofErr w:type="spellEnd"/>
+      <w:r>
+        <w:t>": "2026-04-20T14:00:00",</w:t>
+      </w:r>
+    </w:p>
+    <w:p>
+      <w:r>
+        <w:t xml:space="preserve">  "</w:t>
+      </w:r>
+      <w:proofErr w:type="spellStart"/>
+      <w:r>
+        <w:t>horaFin</w:t>
+      </w:r>
+      <w:proofErr w:type="spellEnd"/>
+      <w:r>
+        <w:t>": "2026-04-20T16:00:00",</w:t>
+      </w:r>
+    </w:p>
+    <w:p>
+      <w:r>
+        <w:t xml:space="preserve">  "cupo": 20,</w:t>
+      </w:r>
+    </w:p>
+    <w:p>
+      <w:r>
+        <w:t xml:space="preserve">  "tipo": "Workshop"</w:t>
+      </w:r>
+    </w:p>
+    <w:p>
+      <w:r>
+        <w:t>}</w:t>
+      </w:r>
+    </w:p>
+    <w:p>
+      <w:r>
+        <w:t>INSCRIPCIONES</w:t>
+      </w:r>
+    </w:p>
+    <w:p>
+      <w:r>
+        <w:t>{</w:t>
+      </w:r>
+    </w:p>
+    <w:p>
+      <w:r>
+        <w:lastRenderedPageBreak/>
+        <w:t xml:space="preserve">  "</w:t>
+      </w:r>
+      <w:proofErr w:type="spellStart"/>
+      <w:r>
+        <w:t>id_Usuario</w:t>
+      </w:r>
+      <w:proofErr w:type="spellEnd"/>
+      <w:r>
+        <w:t>": 1,</w:t>
+      </w:r>
+    </w:p>
+    <w:p>
+      <w:r>
+        <w:t xml:space="preserve">  "</w:t>
+      </w:r>
+      <w:proofErr w:type="spellStart"/>
+      <w:r>
+        <w:t>id_Evento</w:t>
+      </w:r>
+      <w:proofErr w:type="spellEnd"/>
+      <w:r>
+        <w:t>": 1,</w:t>
+      </w:r>
+    </w:p>
+    <w:p>
+      <w:r>
+        <w:t xml:space="preserve">  "</w:t>
+      </w:r>
+      <w:proofErr w:type="spellStart"/>
+      <w:r>
+        <w:t>fechaInscripcion</w:t>
+      </w:r>
+      <w:proofErr w:type="spellEnd"/>
+      <w:r>
+        <w:t>": "2026-04-16T15:30:00",</w:t>
+      </w:r>
+    </w:p>
+    <w:p>
+      <w:r>
+        <w:t xml:space="preserve">  "estado": "Pendiente",</w:t>
+      </w:r>
+    </w:p>
+    <w:p>
+      <w:r>
+        <w:t xml:space="preserve">  "usuario": </w:t>
+      </w:r>
+      <w:proofErr w:type="spellStart"/>
+      <w:r>
+        <w:t>null</w:t>
+      </w:r>
+      <w:proofErr w:type="spellEnd"/>
+      <w:r>
+        <w:t>,</w:t>
+      </w:r>
+    </w:p>
+    <w:p>
+      <w:r>
+        <w:t xml:space="preserve">  "evento": </w:t>
+      </w:r>
+      <w:proofErr w:type="spellStart"/>
+      <w:r>
+        <w:t>null</w:t>
+      </w:r>
+      <w:proofErr w:type="spellEnd"/>
     </w:p>
     <w:p>
       <w:r>

</xml_diff>

<commit_message>
Se terminan todos los controllers
</commit_message>
<xml_diff>
--- a/GestionEventos/Archivos/JSON.docx
+++ b/GestionEventos/Archivos/JSON.docx
@@ -14,15 +14,7 @@
     </w:p>
     <w:p>
       <w:r>
-        <w:t xml:space="preserve">  "nombre": "Juan </w:t>
-      </w:r>
-      <w:proofErr w:type="spellStart"/>
-      <w:r>
-        <w:t>Jose</w:t>
-      </w:r>
-      <w:proofErr w:type="spellEnd"/>
-      <w:r>
-        <w:t xml:space="preserve"> Quiroz",</w:t>
+        <w:t xml:space="preserve">  "nombre": "Juan Jose Quiroz",</w:t>
       </w:r>
     </w:p>
     <w:p>
@@ -32,15 +24,7 @@
     </w:p>
     <w:p>
       <w:r>
-        <w:t xml:space="preserve">  "</w:t>
-      </w:r>
-      <w:proofErr w:type="spellStart"/>
-      <w:r>
-        <w:t>contrasena</w:t>
-      </w:r>
-      <w:proofErr w:type="spellEnd"/>
-      <w:r>
-        <w:t>": "123456",</w:t>
+        <w:t xml:space="preserve">  "contrasena": "123456",</w:t>
       </w:r>
     </w:p>
     <w:p>
@@ -70,41 +54,17 @@
     </w:p>
     <w:p>
       <w:r>
-        <w:t xml:space="preserve">  "</w:t>
-      </w:r>
-      <w:proofErr w:type="spellStart"/>
-      <w:r>
-        <w:t>descripcion</w:t>
-      </w:r>
-      <w:proofErr w:type="spellEnd"/>
-      <w:r>
-        <w:t>": "Evento sobre innovación y tecnología",</w:t>
-      </w:r>
-    </w:p>
-    <w:p>
-      <w:r>
-        <w:t xml:space="preserve">  "</w:t>
-      </w:r>
-      <w:proofErr w:type="spellStart"/>
-      <w:r>
-        <w:t>fechaInicio</w:t>
-      </w:r>
-      <w:proofErr w:type="spellEnd"/>
-      <w:r>
-        <w:t>": "2026-05-15T09:00:00",</w:t>
-      </w:r>
-    </w:p>
-    <w:p>
-      <w:r>
-        <w:t xml:space="preserve">  "</w:t>
-      </w:r>
-      <w:proofErr w:type="spellStart"/>
-      <w:r>
-        <w:t>fechaFin</w:t>
-      </w:r>
-      <w:proofErr w:type="spellEnd"/>
-      <w:r>
-        <w:t>": "2026-05-15T18:00:00",</w:t>
+        <w:t xml:space="preserve">  "descripcion": "Evento sobre innovación y tecnología",</w:t>
+      </w:r>
+    </w:p>
+    <w:p>
+      <w:r>
+        <w:t xml:space="preserve">  "fechaInicio": "2026-05-15T09:00:00",</w:t>
+      </w:r>
+    </w:p>
+    <w:p>
+      <w:r>
+        <w:t xml:space="preserve">  "fechaFin": "2026-05-15T18:00:00",</w:t>
       </w:r>
     </w:p>
     <w:p>
@@ -119,15 +79,7 @@
     </w:p>
     <w:p>
       <w:r>
-        <w:t xml:space="preserve">  "</w:t>
-      </w:r>
-      <w:proofErr w:type="spellStart"/>
-      <w:r>
-        <w:t>cupoTotal</w:t>
-      </w:r>
-      <w:proofErr w:type="spellEnd"/>
-      <w:r>
-        <w:t>": 300,</w:t>
+        <w:t xml:space="preserve">  "cupoTotal": 300,</w:t>
       </w:r>
     </w:p>
     <w:p>
@@ -137,15 +89,7 @@
     </w:p>
     <w:p>
       <w:r>
-        <w:t xml:space="preserve">  "</w:t>
-      </w:r>
-      <w:proofErr w:type="spellStart"/>
-      <w:r>
-        <w:t>id_Organizador</w:t>
-      </w:r>
-      <w:proofErr w:type="spellEnd"/>
-      <w:r>
-        <w:t>": 1</w:t>
+        <w:t xml:space="preserve">  "id_Organizador": 1</w:t>
       </w:r>
     </w:p>
     <w:p>
@@ -170,41 +114,17 @@
     </w:p>
     <w:p>
       <w:r>
-        <w:t xml:space="preserve">  "</w:t>
-      </w:r>
-      <w:proofErr w:type="spellStart"/>
-      <w:r>
-        <w:t>descripcion</w:t>
-      </w:r>
-      <w:proofErr w:type="spellEnd"/>
-      <w:r>
-        <w:t>": "Descripción actualizada",</w:t>
-      </w:r>
-    </w:p>
-    <w:p>
-      <w:r>
-        <w:t xml:space="preserve">  "</w:t>
-      </w:r>
-      <w:proofErr w:type="spellStart"/>
-      <w:r>
-        <w:t>fechaInicio</w:t>
-      </w:r>
-      <w:proofErr w:type="spellEnd"/>
-      <w:r>
-        <w:t>": "2026-05-20T09:00:00",</w:t>
-      </w:r>
-    </w:p>
-    <w:p>
-      <w:r>
-        <w:t xml:space="preserve">  "</w:t>
-      </w:r>
-      <w:proofErr w:type="spellStart"/>
-      <w:r>
-        <w:t>fechaFin</w:t>
-      </w:r>
-      <w:proofErr w:type="spellEnd"/>
-      <w:r>
-        <w:t>": "2026-05-20T18:00:00",</w:t>
+        <w:t xml:space="preserve">  "descripcion": "Descripción actualizada",</w:t>
+      </w:r>
+    </w:p>
+    <w:p>
+      <w:r>
+        <w:t xml:space="preserve">  "fechaInicio": "2026-05-20T09:00:00",</w:t>
+      </w:r>
+    </w:p>
+    <w:p>
+      <w:r>
+        <w:t xml:space="preserve">  "fechaFin": "2026-05-20T18:00:00",</w:t>
       </w:r>
     </w:p>
     <w:p>
@@ -220,15 +140,7 @@
     </w:p>
     <w:p>
       <w:r>
-        <w:t xml:space="preserve">  "</w:t>
-      </w:r>
-      <w:proofErr w:type="spellStart"/>
-      <w:r>
-        <w:t>cupoTotal</w:t>
-      </w:r>
-      <w:proofErr w:type="spellEnd"/>
-      <w:r>
-        <w:t>": 400</w:t>
+        <w:t xml:space="preserve">  "cupoTotal": 400</w:t>
       </w:r>
     </w:p>
     <w:p>
@@ -311,80 +223,32 @@
     </w:p>
     <w:p>
       <w:r>
-        <w:t xml:space="preserve">  "</w:t>
-      </w:r>
-      <w:proofErr w:type="spellStart"/>
-      <w:r>
-        <w:t>id_Evento</w:t>
-      </w:r>
-      <w:proofErr w:type="spellEnd"/>
-      <w:r>
-        <w:t>": 1,</w:t>
-      </w:r>
-    </w:p>
-    <w:p>
-      <w:r>
-        <w:t xml:space="preserve">  "</w:t>
-      </w:r>
-      <w:proofErr w:type="spellStart"/>
-      <w:r>
-        <w:t>id_Ponente</w:t>
-      </w:r>
-      <w:proofErr w:type="spellEnd"/>
-      <w:r>
-        <w:t>": 5,</w:t>
-      </w:r>
-    </w:p>
-    <w:p>
-      <w:r>
-        <w:t xml:space="preserve">  "titulo": "Sesión de Live </w:t>
-      </w:r>
-      <w:proofErr w:type="spellStart"/>
-      <w:r>
-        <w:t>Coding</w:t>
-      </w:r>
-      <w:proofErr w:type="spellEnd"/>
-      <w:r>
-        <w:t>",</w:t>
-      </w:r>
-    </w:p>
-    <w:p>
-      <w:r>
-        <w:t xml:space="preserve">  "</w:t>
-      </w:r>
-      <w:proofErr w:type="spellStart"/>
-      <w:r>
-        <w:t>descripcion</w:t>
-      </w:r>
-      <w:proofErr w:type="spellEnd"/>
-      <w:r>
-        <w:t>": "Desarrollo de una API paso a paso.",</w:t>
-      </w:r>
-    </w:p>
-    <w:p>
-      <w:r>
-        <w:t xml:space="preserve">  "</w:t>
-      </w:r>
-      <w:proofErr w:type="spellStart"/>
-      <w:r>
-        <w:t>horaInicio</w:t>
-      </w:r>
-      <w:proofErr w:type="spellEnd"/>
-      <w:r>
-        <w:t>": "2026-04-20T14:00:00",</w:t>
-      </w:r>
-    </w:p>
-    <w:p>
-      <w:r>
-        <w:t xml:space="preserve">  "</w:t>
-      </w:r>
-      <w:proofErr w:type="spellStart"/>
-      <w:r>
-        <w:t>horaFin</w:t>
-      </w:r>
-      <w:proofErr w:type="spellEnd"/>
-      <w:r>
-        <w:t>": "2026-04-20T16:00:00",</w:t>
+        <w:t xml:space="preserve">  "id_Evento": 1,</w:t>
+      </w:r>
+    </w:p>
+    <w:p>
+      <w:r>
+        <w:t xml:space="preserve">  "id_Ponente": 5,</w:t>
+      </w:r>
+    </w:p>
+    <w:p>
+      <w:r>
+        <w:t xml:space="preserve">  "titulo": "Sesión de Live Coding",</w:t>
+      </w:r>
+    </w:p>
+    <w:p>
+      <w:r>
+        <w:t xml:space="preserve">  "descripcion": "Desarrollo de una API paso a paso.",</w:t>
+      </w:r>
+    </w:p>
+    <w:p>
+      <w:r>
+        <w:t xml:space="preserve">  "horaInicio": "2026-04-20T14:00:00",</w:t>
+      </w:r>
+    </w:p>
+    <w:p>
+      <w:r>
+        <w:t xml:space="preserve">  "horaFin": "2026-04-20T16:00:00",</w:t>
       </w:r>
     </w:p>
     <w:p>
@@ -415,41 +279,17 @@
     <w:p>
       <w:r>
         <w:lastRenderedPageBreak/>
-        <w:t xml:space="preserve">  "</w:t>
-      </w:r>
-      <w:proofErr w:type="spellStart"/>
-      <w:r>
-        <w:t>id_Usuario</w:t>
-      </w:r>
-      <w:proofErr w:type="spellEnd"/>
-      <w:r>
-        <w:t>": 1,</w:t>
-      </w:r>
-    </w:p>
-    <w:p>
-      <w:r>
-        <w:t xml:space="preserve">  "</w:t>
-      </w:r>
-      <w:proofErr w:type="spellStart"/>
-      <w:r>
-        <w:t>id_Evento</w:t>
-      </w:r>
-      <w:proofErr w:type="spellEnd"/>
-      <w:r>
-        <w:t>": 1,</w:t>
-      </w:r>
-    </w:p>
-    <w:p>
-      <w:r>
-        <w:t xml:space="preserve">  "</w:t>
-      </w:r>
-      <w:proofErr w:type="spellStart"/>
-      <w:r>
-        <w:t>fechaInscripcion</w:t>
-      </w:r>
-      <w:proofErr w:type="spellEnd"/>
-      <w:r>
-        <w:t>": "2026-04-16T15:30:00",</w:t>
+        <w:t xml:space="preserve">  "id_Usuario": 1,</w:t>
+      </w:r>
+    </w:p>
+    <w:p>
+      <w:r>
+        <w:t xml:space="preserve">  "id_Evento": 1,</w:t>
+      </w:r>
+    </w:p>
+    <w:p>
+      <w:r>
+        <w:t xml:space="preserve">  "fechaInscripcion": "2026-04-16T15:30:00",</w:t>
       </w:r>
     </w:p>
     <w:p>
@@ -459,26 +299,126 @@
     </w:p>
     <w:p>
       <w:r>
-        <w:t xml:space="preserve">  "usuario": </w:t>
-      </w:r>
-      <w:proofErr w:type="spellStart"/>
-      <w:r>
-        <w:t>null</w:t>
-      </w:r>
-      <w:proofErr w:type="spellEnd"/>
-      <w:r>
-        <w:t>,</w:t>
-      </w:r>
-    </w:p>
-    <w:p>
-      <w:r>
-        <w:t xml:space="preserve">  "evento": </w:t>
-      </w:r>
-      <w:proofErr w:type="spellStart"/>
-      <w:r>
-        <w:t>null</w:t>
-      </w:r>
-      <w:proofErr w:type="spellEnd"/>
+        <w:t xml:space="preserve">  "usuario": null,</w:t>
+      </w:r>
+    </w:p>
+    <w:p>
+      <w:r>
+        <w:t xml:space="preserve">  "evento": null</w:t>
+      </w:r>
+    </w:p>
+    <w:p>
+      <w:r>
+        <w:t>}</w:t>
+      </w:r>
+    </w:p>
+    <w:p/>
+    <w:p>
+      <w:r>
+        <w:t>Material</w:t>
+      </w:r>
+    </w:p>
+    <w:p>
+      <w:r>
+        <w:t>{</w:t>
+      </w:r>
+    </w:p>
+    <w:p>
+      <w:r>
+        <w:t xml:space="preserve">  "id_Evento": 1,</w:t>
+      </w:r>
+    </w:p>
+    <w:p>
+      <w:r>
+        <w:t xml:space="preserve">  "nombre": "Guía de Arquitectura .NET 10",</w:t>
+      </w:r>
+    </w:p>
+    <w:p>
+      <w:r>
+        <w:t xml:space="preserve">  "tipo": "PDF",</w:t>
+      </w:r>
+    </w:p>
+    <w:p>
+      <w:r>
+        <w:t xml:space="preserve">  "url": "https://mi-servidor.com/materiales/guia-arq.pdf",</w:t>
+      </w:r>
+    </w:p>
+    <w:p>
+      <w:r>
+        <w:t xml:space="preserve">  "fechaSubida": "2026-04-25T13:00:00",</w:t>
+      </w:r>
+    </w:p>
+    <w:p>
+      <w:r>
+        <w:t xml:space="preserve">  "evento": null</w:t>
+      </w:r>
+    </w:p>
+    <w:p>
+      <w:r>
+        <w:t>}</w:t>
+      </w:r>
+    </w:p>
+    <w:p>
+      <w:r>
+        <w:t>Certificado</w:t>
+      </w:r>
+    </w:p>
+    <w:p>
+      <w:r>
+        <w:t>{</w:t>
+      </w:r>
+    </w:p>
+    <w:p>
+      <w:r>
+        <w:t xml:space="preserve">  "id_Inscripcion": 1,</w:t>
+      </w:r>
+    </w:p>
+    <w:p>
+      <w:r>
+        <w:t xml:space="preserve">  "fechaGeneracion": "2026-04-25T13:30:00",</w:t>
+      </w:r>
+    </w:p>
+    <w:p>
+      <w:r>
+        <w:t xml:space="preserve">  </w:t>
+      </w:r>
+      <w:r>
+        <w:t>"urlPDF": "https://tusitio.com/certificados/cert-001.pdf",</w:t>
+      </w:r>
+    </w:p>
+    <w:p>
+      <w:r>
+        <w:t xml:space="preserve">  </w:t>
+      </w:r>
+      <w:r>
+        <w:t>"codigoValidacion": "CERT-2026-ABC123X"</w:t>
+      </w:r>
+    </w:p>
+    <w:p>
+      <w:r>
+        <w:t>}</w:t>
+      </w:r>
+    </w:p>
+    <w:p>
+      <w:r>
+        <w:t>inscripcionesActividades</w:t>
+      </w:r>
+    </w:p>
+    <w:p>
+      <w:r>
+        <w:t>{</w:t>
+      </w:r>
+    </w:p>
+    <w:p>
+      <w:r>
+        <w:lastRenderedPageBreak/>
+        <w:t xml:space="preserve">  "id_Inscripcion": 1,</w:t>
+      </w:r>
+    </w:p>
+    <w:p>
+      <w:r>
+        <w:t xml:space="preserve">  "id_Actividad": 1</w:t>
+      </w:r>
     </w:p>
     <w:p>
       <w:r>

</xml_diff>